<commit_message>
finished writing report (note: i need link to the demo)
</commit_message>
<xml_diff>
--- a/Report.docx
+++ b/Report.docx
@@ -28,16 +28,1416 @@
     </w:p>
     <w:p>
       <w:pPr>
+        <w:pStyle w:val="Heading2"/>
+      </w:pPr>
+      <w:r>
+        <w:t xml:space="preserve">1. </w:t>
+      </w:r>
+      <w:r>
+        <w:t>Overview</w:t>
+      </w:r>
+    </w:p>
+    <w:p>
+      <w:pPr>
         <w:spacing w:line="276" w:lineRule="auto"/>
       </w:pPr>
       <w:r>
-        <w:t>Diagnostic</w:t>
+        <w:t xml:space="preserve">My system is a hybrid retrieval-augmented generation pipeline built on a corpus of University of Waterloo Faculty of Mathematics undergraduate course descriptions. </w:t>
+      </w:r>
+      <w:r>
+        <w:t xml:space="preserve">A query goes to two retrievers at once: a sparse BM25 index and a dense embedding index. Their ranked results are combined using Reciprocal Rank Fusion (RRF). The top passages from that combined ranking are inserted into a structured prompt and sent to a locally hosted Qwen2.5 7B-Instruct model, served through </w:t>
+      </w:r>
+      <w:proofErr w:type="spellStart"/>
+      <w:r>
+        <w:t>Ollama</w:t>
+      </w:r>
+      <w:proofErr w:type="spellEnd"/>
+      <w:r>
+        <w:t>. The model is instructed to answer strictly from the provided context, cite its claims inline, and decline to answer when the context isn't sufficient.</w:t>
+      </w:r>
+    </w:p>
+    <w:p>
+      <w:pPr>
+        <w:pStyle w:val="Heading2"/>
+      </w:pPr>
+      <w:r>
+        <w:t xml:space="preserve">2. </w:t>
+      </w:r>
+      <w:r>
+        <w:t>Corpus Construction</w:t>
       </w:r>
     </w:p>
     <w:p>
       <w:pPr>
         <w:spacing w:line="276" w:lineRule="auto"/>
-        <w:ind w:firstLine="720"/>
+      </w:pPr>
+      <w:r>
+        <w:t xml:space="preserve">Documents came from the University of Waterloo Open Data API v3 (openapi.data.uwaterloo.ca), an official public API backed by the registrar, using its Courses endpoint. </w:t>
+      </w:r>
+      <w:r>
+        <w:t>I</w:t>
+      </w:r>
+      <w:r>
+        <w:t xml:space="preserve"> limited collection to the ten subject codes housed in the Faculty of Mathematics (CS, MATH, STAT, AMATH, CO, PMATH, ACTSC, SE, BIOSTAT, CM), restricted to undergraduate offerings only.</w:t>
+      </w:r>
+    </w:p>
+    <w:p>
+      <w:pPr>
+        <w:spacing w:line="276" w:lineRule="auto"/>
+      </w:pPr>
+      <w:r>
+        <w:t>The Courses endpoint is scoped to a single term, so querying only one term would miss any course that isn't offered every term. To get full coverage</w:t>
+      </w:r>
+      <w:r>
+        <w:t>,</w:t>
+      </w:r>
+      <w:r>
+        <w:t xml:space="preserve"> </w:t>
+      </w:r>
+      <w:r>
+        <w:t>I</w:t>
+      </w:r>
+      <w:r>
+        <w:t xml:space="preserve"> queried three fixed terms spanning one academic year (Fall 2024, Winter 2025, and Spring 2025, term codes 1249, 1251, and 1255) and merged the results by course ID, keeping whichever record </w:t>
+      </w:r>
+      <w:r>
+        <w:t>had</w:t>
+      </w:r>
+      <w:r>
+        <w:t xml:space="preserve"> a description. </w:t>
+      </w:r>
+      <w:r>
+        <w:t>I</w:t>
+      </w:r>
+      <w:r>
+        <w:t xml:space="preserve"> pinned specific past terms instead of always using the current </w:t>
+      </w:r>
+      <w:r>
+        <w:t>one,</w:t>
+      </w:r>
+      <w:r>
+        <w:t xml:space="preserve"> so the corpus stays reproducible and doesn't quietly change as terms roll over.</w:t>
+      </w:r>
+    </w:p>
+    <w:p>
+      <w:pPr>
+        <w:spacing w:line="276" w:lineRule="auto"/>
+      </w:pPr>
+      <w:r>
+        <w:t xml:space="preserve">Each merged course record became one retrieval document containing the subject, catalog number, title, description, and requirements text (prerequisites, </w:t>
+      </w:r>
+      <w:proofErr w:type="spellStart"/>
+      <w:r>
+        <w:t>antirequisites</w:t>
+      </w:r>
+      <w:proofErr w:type="spellEnd"/>
+      <w:r>
+        <w:t xml:space="preserve">, corequisites), with a stable unique ID in the form </w:t>
+      </w:r>
+      <w:proofErr w:type="spellStart"/>
+      <w:r>
+        <w:t>uw</w:t>
+      </w:r>
+      <w:proofErr w:type="spellEnd"/>
+      <w:r>
+        <w:t>-course-{subject}-{</w:t>
+      </w:r>
+      <w:proofErr w:type="spellStart"/>
+      <w:r>
+        <w:t>catalog_number</w:t>
+      </w:r>
+      <w:proofErr w:type="spellEnd"/>
+      <w:r>
+        <w:t>}.</w:t>
+      </w:r>
+    </w:p>
+    <w:p>
+      <w:pPr>
+        <w:spacing w:line="276" w:lineRule="auto"/>
+      </w:pPr>
+      <w:r>
+        <w:t>I</w:t>
+      </w:r>
+      <w:r>
+        <w:t xml:space="preserve"> also filtered out documents with empty or non-substantive descriptions. This used a minimum word-count floor along with regular-expression patterns for known placeholder phrasing, such as cross-listed courses whose description just says something like "refer to [external institution]'s calendar" instead of containing real content. This filter took some tuning: an initial 8-word threshold turned out to discard legitimate, if terse, descriptions too, including one that just read "Enriched version of CS251." </w:t>
+      </w:r>
+      <w:r>
+        <w:t>I</w:t>
+      </w:r>
+      <w:r>
+        <w:t xml:space="preserve"> caught this while building </w:t>
+      </w:r>
+      <w:r>
+        <w:lastRenderedPageBreak/>
+        <w:t>the evaluation set and lowered the threshold to 4 words.</w:t>
+      </w:r>
+      <w:r>
+        <w:t xml:space="preserve"> </w:t>
+      </w:r>
+      <w:r>
+        <w:t xml:space="preserve">The final corpus contains 342 documents, comfortably within the </w:t>
+      </w:r>
+      <w:r>
+        <w:t>project</w:t>
+      </w:r>
+      <w:r>
+        <w:t xml:space="preserve">'s 200 to 2,000 document </w:t>
+      </w:r>
+      <w:r>
+        <w:t xml:space="preserve">requirement </w:t>
+      </w:r>
+      <w:r>
+        <w:t>range.</w:t>
+      </w:r>
+    </w:p>
+    <w:p>
+      <w:pPr>
+        <w:pStyle w:val="Heading2"/>
+      </w:pPr>
+      <w:r>
+        <w:t xml:space="preserve">3. </w:t>
+      </w:r>
+      <w:r>
+        <w:t>Diagnosis Experiment</w:t>
+      </w:r>
+    </w:p>
+    <w:p>
+      <w:pPr>
+        <w:spacing w:after="140"/>
+      </w:pPr>
+      <w:r>
+        <w:t xml:space="preserve">To check that the corpus wasn't already well known to the generation model, </w:t>
+      </w:r>
+      <w:r>
+        <w:t>I</w:t>
+      </w:r>
+      <w:r>
+        <w:t xml:space="preserve"> wrote ten factual questions targeting specific, granular facts: exact prerequisite and </w:t>
+      </w:r>
+      <w:proofErr w:type="spellStart"/>
+      <w:r>
+        <w:t>antirequisite</w:t>
+      </w:r>
+      <w:proofErr w:type="spellEnd"/>
+      <w:r>
+        <w:t xml:space="preserve"> course codes, minimum grade thresholds, program restrictions. These were posed to bare Qwen2.5 7B-Instruct with no retrieved context, using the same temperature=0, seed=42 settings as the rest of the pipeline.</w:t>
+      </w:r>
+    </w:p>
+    <w:p>
+      <w:pPr>
+        <w:spacing w:after="140"/>
+      </w:pPr>
+      <w:r>
+        <w:t xml:space="preserve">The model got 0 out of 10 correct. It either declined to answer or gave a plausible but wrong course code. It's likely that granular institutional catalog data like this is long-tail, low-frequency text that simply isn't well represented in general pretraining data, no matter how recent. That supports treating this corpus as a good fit for demonstrating what retrieval </w:t>
+      </w:r>
+      <w:r>
+        <w:t>adds</w:t>
+      </w:r>
+      <w:r>
+        <w:t>.</w:t>
+      </w:r>
+    </w:p>
+    <w:p>
+      <w:pPr>
+        <w:pStyle w:val="Heading2"/>
+      </w:pPr>
+      <w:r>
+        <w:t xml:space="preserve">4. </w:t>
+      </w:r>
+      <w:r>
+        <w:t>Retrieval System</w:t>
+      </w:r>
+    </w:p>
+    <w:p>
+      <w:pPr>
+        <w:pStyle w:val="Heading3"/>
+      </w:pPr>
+      <w:r>
+        <w:t xml:space="preserve">4.1 </w:t>
+      </w:r>
+      <w:r>
+        <w:t>Sparse Retrieval (BM25)</w:t>
+      </w:r>
+    </w:p>
+    <w:p>
+      <w:pPr>
+        <w:spacing w:after="140"/>
+      </w:pPr>
+      <w:r>
+        <w:t xml:space="preserve">This was implemented with rank_bm25 (BM25Okapi) over a custom tokenizer that lowercases text, strips punctuation, tokenizes on whitespace, removes English </w:t>
+      </w:r>
+      <w:proofErr w:type="spellStart"/>
+      <w:r>
+        <w:t>stopwords</w:t>
+      </w:r>
+      <w:proofErr w:type="spellEnd"/>
+      <w:r>
+        <w:t>, and applies a small domain-specific normalization step. That last part maps full words like "prerequisite", "</w:t>
+      </w:r>
+      <w:proofErr w:type="spellStart"/>
+      <w:r>
+        <w:t>antirequisite</w:t>
+      </w:r>
+      <w:proofErr w:type="spellEnd"/>
+      <w:r>
+        <w:t>", and "corequisite" to the catalog's own abbreviations ("</w:t>
+      </w:r>
+      <w:proofErr w:type="spellStart"/>
+      <w:r>
+        <w:t>prereq</w:t>
+      </w:r>
+      <w:proofErr w:type="spellEnd"/>
+      <w:r>
+        <w:t>", "</w:t>
+      </w:r>
+      <w:proofErr w:type="spellStart"/>
+      <w:r>
+        <w:t>antireq</w:t>
+      </w:r>
+      <w:proofErr w:type="spellEnd"/>
+      <w:r>
+        <w:t>", "</w:t>
+      </w:r>
+      <w:proofErr w:type="spellStart"/>
+      <w:r>
+        <w:t>coreq</w:t>
+      </w:r>
+      <w:proofErr w:type="spellEnd"/>
+      <w:r>
+        <w:t>"), closing a vocabulary gap that would otherwise trip up a natural-language question against the corpus's abbreviated phrasing.</w:t>
+      </w:r>
+    </w:p>
+    <w:p>
+      <w:pPr>
+        <w:pStyle w:val="Heading3"/>
+      </w:pPr>
+      <w:r>
+        <w:t xml:space="preserve">4.2 </w:t>
+      </w:r>
+      <w:r>
+        <w:t>Dense Retrieval</w:t>
+      </w:r>
+    </w:p>
+    <w:p>
+      <w:pPr>
+        <w:spacing w:after="140"/>
+      </w:pPr>
+      <w:r>
+        <w:t xml:space="preserve">This uses BAAI/bge-small-en-v1.5 (sentence-transformers, 384-dimensional embeddings). </w:t>
+      </w:r>
+      <w:r>
+        <w:t>I</w:t>
+      </w:r>
+      <w:r>
+        <w:t xml:space="preserve"> picked it over the smaller all-MiniLM-L6-v2 baseline because it's trained specifically for retrieval and performs consistently better on retrieval benchmarks like BEIR and MTEB, at a similar computational cost. Following BGE's asymmetric retrieval setup, queries get prefixed with the instruction "Represent this sentence for searching relevant passages: " before being embedded, while documents are embedded with no prefix at all. Every embedding is L2-normalized, so cosine similarity just becomes a dot product. Document embeddings are cached to disk along with a manifest that records the exact ordered list of document IDs used to build them. On load, that manifest gets checked against the current corpus's document IDs, not just a document count, so a stale or misaligned cache can't get reused silently after the corpus changes.</w:t>
+      </w:r>
+    </w:p>
+    <w:p>
+      <w:pPr>
+        <w:pStyle w:val="Heading3"/>
+      </w:pPr>
+      <w:r>
+        <w:lastRenderedPageBreak/>
+        <w:t xml:space="preserve">4.3 </w:t>
+      </w:r>
+      <w:r>
+        <w:t>Fusion</w:t>
+      </w:r>
+    </w:p>
+    <w:p>
+      <w:pPr>
+        <w:spacing w:after="140"/>
+      </w:pPr>
+      <w:r>
+        <w:t xml:space="preserve">The two retrievers' top 20 candidates get combined with Reciprocal Rank Fusion using k=60, the standard default. RRF sums a 1/(k + rank) contribution from every list a document shows up in. </w:t>
+      </w:r>
+      <w:r>
+        <w:t>I</w:t>
+      </w:r>
+      <w:r>
+        <w:t xml:space="preserve"> chose RRF over a normalized linear score combination because BM25 scores and cosine similarities sit on completely different numeric scales, and RRF avoids that problem by fusing on rank position instead of raw score. Section 8 walks through a real limitation this choice runs into.</w:t>
+      </w:r>
+    </w:p>
+    <w:p>
+      <w:pPr>
+        <w:pStyle w:val="Heading2"/>
+      </w:pPr>
+      <w:r>
+        <w:t>5. Generation</w:t>
+      </w:r>
+    </w:p>
+    <w:p>
+      <w:pPr>
+        <w:spacing w:after="140"/>
+      </w:pPr>
+      <w:r>
+        <w:t xml:space="preserve">Generation uses Qwen2.5 7B-Instruct at Q4_K_M quantization, served locally through </w:t>
+      </w:r>
+      <w:proofErr w:type="spellStart"/>
+      <w:r>
+        <w:t>Ollama's</w:t>
+      </w:r>
+      <w:proofErr w:type="spellEnd"/>
+      <w:r>
+        <w:t xml:space="preserve"> HTTP API. Every generation call uses temperature=0 and a fixed seed of 42 for reproducibility. Earlier runs without these settings showed real answer instability, discussed in Section 7.</w:t>
+      </w:r>
+    </w:p>
+    <w:p>
+      <w:pPr>
+        <w:pStyle w:val="Heading3"/>
+      </w:pPr>
+      <w:r>
+        <w:t>Prompt Template</w:t>
+      </w:r>
+    </w:p>
+    <w:p>
+      <w:pPr>
+        <w:spacing w:after="140"/>
+      </w:pPr>
+      <w:r>
+        <w:t xml:space="preserve">"You are a course advising assistant for the University of Waterloo Faculty of Mathematics. Answer the user's question using ONLY the information in the numbered context chunks below. Rules: (1) Base your answer strictly on the provided context; do not use outside knowledge. (2) Every factual claim must include an inline citation to the chunk(s) it came from, using the format [1], [2], etc. (3) If the context does not contain enough information, respond with exactly \"I don't know\" followed by a brief explanation of what's missing; do not guess. (4) Be concise and direct." followed by the numbered retrieved chunks (with </w:t>
+      </w:r>
+      <w:proofErr w:type="spellStart"/>
+      <w:r>
+        <w:t>doc_id</w:t>
+      </w:r>
+      <w:proofErr w:type="spellEnd"/>
+      <w:r>
+        <w:t xml:space="preserve"> shown) and the user's question.</w:t>
+      </w:r>
+    </w:p>
+    <w:p>
+      <w:pPr>
+        <w:pStyle w:val="Heading2"/>
+      </w:pPr>
+      <w:r>
+        <w:t>6. Evaluation Set Construction</w:t>
+      </w:r>
+    </w:p>
+    <w:p>
+      <w:pPr>
+        <w:spacing w:after="140"/>
+      </w:pPr>
+      <w:r>
+        <w:t>The hand-written evaluation set has 10 questions: 6 factoid, 2 multi-hop, and 2 unanswerable. Each question has a human-verified reference answer and a ground-truth source document ID list, left empty for the unanswerable questions since no document should support an answer there.</w:t>
+      </w:r>
+    </w:p>
+    <w:p>
+      <w:pPr>
+        <w:spacing w:after="140"/>
+      </w:pPr>
+      <w:r>
+        <w:t>C</w:t>
+      </w:r>
+      <w:r>
+        <w:t xml:space="preserve">andidate questions were first drafted with LLM assistance after reviewing a sample of corpus documents, then manually checked against the live corpus files and corrected before being finalized. </w:t>
+      </w:r>
+    </w:p>
+    <w:p>
+      <w:pPr>
+        <w:pStyle w:val="Heading3"/>
+      </w:pPr>
+      <w:r>
+        <w:t>Potential Sources of Bias</w:t>
+      </w:r>
+    </w:p>
+    <w:p>
+      <w:pPr>
+        <w:pStyle w:val="ListParagraph"/>
+        <w:numPr>
+          <w:ilvl w:val="0"/>
+          <w:numId w:val="2"/>
+        </w:numPr>
+        <w:spacing w:after="60" w:line="240" w:lineRule="auto"/>
+      </w:pPr>
+      <w:r>
+        <w:t xml:space="preserve">Prerequisite, </w:t>
+      </w:r>
+      <w:proofErr w:type="spellStart"/>
+      <w:r>
+        <w:t>antirequisite</w:t>
+      </w:r>
+      <w:proofErr w:type="spellEnd"/>
+      <w:r>
+        <w:t>, and corequisite metadata is the most structured field in the corpus, so questions skew toward it more than toward free-text description content. That could overstate retrieval performance on structured facts compared to general description content.</w:t>
+      </w:r>
+    </w:p>
+    <w:p>
+      <w:pPr>
+        <w:pStyle w:val="ListParagraph"/>
+        <w:numPr>
+          <w:ilvl w:val="0"/>
+          <w:numId w:val="2"/>
+        </w:numPr>
+        <w:spacing w:after="60" w:line="240" w:lineRule="auto"/>
+      </w:pPr>
+      <w:r>
+        <w:lastRenderedPageBreak/>
+        <w:t>Both multi-hop questions were built around pairs of courses with unusually similar or overlapping content, like near-duplicate descriptions or matching program restrictions. That was a deliberate choice to force genuine multi-hop reasoning, but it means this multi-hop subset may not represent multi-hop difficulty in general.</w:t>
+      </w:r>
+    </w:p>
+    <w:p>
+      <w:pPr>
+        <w:pStyle w:val="Heading2"/>
+      </w:pPr>
+      <w:r>
+        <w:t>7. Experimental Results</w:t>
+      </w:r>
+    </w:p>
+    <w:tbl>
+      <w:tblPr>
+        <w:tblStyle w:val="TableGrid"/>
+        <w:tblW w:w="9355" w:type="dxa"/>
+        <w:tblLook w:val="04A0" w:firstRow="1" w:lastRow="0" w:firstColumn="1" w:lastColumn="0" w:noHBand="0" w:noVBand="1"/>
+      </w:tblPr>
+      <w:tblGrid>
+        <w:gridCol w:w="3505"/>
+        <w:gridCol w:w="1170"/>
+        <w:gridCol w:w="4680"/>
+      </w:tblGrid>
+      <w:tr>
+        <w:tc>
+          <w:tcPr>
+            <w:tcW w:w="3505" w:type="dxa"/>
+            <w:shd w:val="clear" w:color="auto" w:fill="C1E4F5" w:themeFill="accent1" w:themeFillTint="33"/>
+          </w:tcPr>
+          <w:p>
+            <w:r>
+              <w:t>Metric</w:t>
+            </w:r>
+          </w:p>
+        </w:tc>
+        <w:tc>
+          <w:tcPr>
+            <w:tcW w:w="1170" w:type="dxa"/>
+            <w:shd w:val="clear" w:color="auto" w:fill="C1E4F5" w:themeFill="accent1" w:themeFillTint="33"/>
+          </w:tcPr>
+          <w:p>
+            <w:r>
+              <w:t>Value</w:t>
+            </w:r>
+          </w:p>
+        </w:tc>
+        <w:tc>
+          <w:tcPr>
+            <w:tcW w:w="4680" w:type="dxa"/>
+            <w:shd w:val="clear" w:color="auto" w:fill="C1E4F5" w:themeFill="accent1" w:themeFillTint="33"/>
+          </w:tcPr>
+          <w:p>
+            <w:r>
+              <w:t>Notes</w:t>
+            </w:r>
+          </w:p>
+        </w:tc>
+      </w:tr>
+      <w:tr>
+        <w:tc>
+          <w:tcPr>
+            <w:tcW w:w="3505" w:type="dxa"/>
+          </w:tcPr>
+          <w:p>
+            <w:r>
+              <w:t>Diagnostic accuracy (bare LLM)</w:t>
+            </w:r>
+          </w:p>
+        </w:tc>
+        <w:tc>
+          <w:tcPr>
+            <w:tcW w:w="1170" w:type="dxa"/>
+          </w:tcPr>
+          <w:p>
+            <w:r>
+              <w:t>0 / 10</w:t>
+            </w:r>
+          </w:p>
+        </w:tc>
+        <w:tc>
+          <w:tcPr>
+            <w:tcW w:w="4680" w:type="dxa"/>
+          </w:tcPr>
+          <w:p>
+            <w:r>
+              <w:t>No retrieved context provided</w:t>
+            </w:r>
+          </w:p>
+        </w:tc>
+      </w:tr>
+      <w:tr>
+        <w:tc>
+          <w:tcPr>
+            <w:tcW w:w="3505" w:type="dxa"/>
+          </w:tcPr>
+          <w:p>
+            <w:r>
+              <w:t>Mean Recall@5</w:t>
+            </w:r>
+          </w:p>
+        </w:tc>
+        <w:tc>
+          <w:tcPr>
+            <w:tcW w:w="1170" w:type="dxa"/>
+          </w:tcPr>
+          <w:p>
+            <w:r>
+              <w:t>1.000</w:t>
+            </w:r>
+          </w:p>
+        </w:tc>
+        <w:tc>
+          <w:tcPr>
+            <w:tcW w:w="4680" w:type="dxa"/>
+          </w:tcPr>
+          <w:p>
+            <w:r>
+              <w:t>8 questions with known gold chunks</w:t>
+            </w:r>
+          </w:p>
+        </w:tc>
+      </w:tr>
+      <w:tr>
+        <w:tc>
+          <w:tcPr>
+            <w:tcW w:w="3505" w:type="dxa"/>
+          </w:tcPr>
+          <w:p>
+            <w:r>
+              <w:t>Mean Reciprocal Rank (MRR)</w:t>
+            </w:r>
+          </w:p>
+        </w:tc>
+        <w:tc>
+          <w:tcPr>
+            <w:tcW w:w="1170" w:type="dxa"/>
+          </w:tcPr>
+          <w:p>
+            <w:r>
+              <w:t>0.900</w:t>
+            </w:r>
+          </w:p>
+        </w:tc>
+        <w:tc>
+          <w:tcPr>
+            <w:tcW w:w="4680" w:type="dxa"/>
+          </w:tcPr>
+          <w:p>
+            <w:r>
+              <w:t>Same 8 questions</w:t>
+            </w:r>
+          </w:p>
+        </w:tc>
+      </w:tr>
+      <w:tr>
+        <w:tc>
+          <w:tcPr>
+            <w:tcW w:w="3505" w:type="dxa"/>
+          </w:tcPr>
+          <w:p>
+            <w:r>
+              <w:t>Generation accuracy</w:t>
+            </w:r>
+          </w:p>
+        </w:tc>
+        <w:tc>
+          <w:tcPr>
+            <w:tcW w:w="1170" w:type="dxa"/>
+          </w:tcPr>
+          <w:p>
+            <w:r>
+              <w:t>10 / 10</w:t>
+            </w:r>
+          </w:p>
+        </w:tc>
+        <w:tc>
+          <w:tcPr>
+            <w:tcW w:w="4680" w:type="dxa"/>
+          </w:tcPr>
+          <w:p>
+            <w:r>
+              <w:t>Final deterministic run (seed=42, temp=0)</w:t>
+            </w:r>
+          </w:p>
+        </w:tc>
+      </w:tr>
+      <w:tr>
+        <w:tc>
+          <w:tcPr>
+            <w:tcW w:w="3505" w:type="dxa"/>
+          </w:tcPr>
+          <w:p>
+            <w:r>
+              <w:t>Correct abstention rate</w:t>
+            </w:r>
+          </w:p>
+        </w:tc>
+        <w:tc>
+          <w:tcPr>
+            <w:tcW w:w="1170" w:type="dxa"/>
+          </w:tcPr>
+          <w:p>
+            <w:r>
+              <w:t>2 / 2</w:t>
+            </w:r>
+          </w:p>
+        </w:tc>
+        <w:tc>
+          <w:tcPr>
+            <w:tcW w:w="4680" w:type="dxa"/>
+          </w:tcPr>
+          <w:p>
+            <w:r>
+              <w:t>Both unanswerable questions</w:t>
+            </w:r>
+          </w:p>
+        </w:tc>
+      </w:tr>
+    </w:tbl>
+    <w:p/>
+    <w:p>
+      <w:r>
+        <w:t>Per-question outcomes on the final deterministic run (seed=42, temperature=0):</w:t>
+      </w:r>
+    </w:p>
+    <w:tbl>
+      <w:tblPr>
+        <w:tblStyle w:val="TableGrid"/>
+        <w:tblW w:w="9355" w:type="dxa"/>
+        <w:tblLook w:val="04A0" w:firstRow="1" w:lastRow="0" w:firstColumn="1" w:lastColumn="0" w:noHBand="0" w:noVBand="1"/>
+      </w:tblPr>
+      <w:tblGrid>
+        <w:gridCol w:w="715"/>
+        <w:gridCol w:w="2790"/>
+        <w:gridCol w:w="4500"/>
+        <w:gridCol w:w="1350"/>
+      </w:tblGrid>
+      <w:tr>
+        <w:tc>
+          <w:tcPr>
+            <w:tcW w:w="715" w:type="dxa"/>
+            <w:shd w:val="clear" w:color="auto" w:fill="C1E4F5" w:themeFill="accent1" w:themeFillTint="33"/>
+          </w:tcPr>
+          <w:p>
+            <w:r>
+              <w:t>ID</w:t>
+            </w:r>
+          </w:p>
+        </w:tc>
+        <w:tc>
+          <w:tcPr>
+            <w:tcW w:w="2790" w:type="dxa"/>
+            <w:shd w:val="clear" w:color="auto" w:fill="C1E4F5" w:themeFill="accent1" w:themeFillTint="33"/>
+          </w:tcPr>
+          <w:p>
+            <w:r>
+              <w:t>Type</w:t>
+            </w:r>
+          </w:p>
+        </w:tc>
+        <w:tc>
+          <w:tcPr>
+            <w:tcW w:w="4500" w:type="dxa"/>
+            <w:shd w:val="clear" w:color="auto" w:fill="C1E4F5" w:themeFill="accent1" w:themeFillTint="33"/>
+          </w:tcPr>
+          <w:p>
+            <w:r>
+              <w:t>Question</w:t>
+            </w:r>
+          </w:p>
+        </w:tc>
+        <w:tc>
+          <w:tcPr>
+            <w:tcW w:w="1350" w:type="dxa"/>
+            <w:shd w:val="clear" w:color="auto" w:fill="C1E4F5" w:themeFill="accent1" w:themeFillTint="33"/>
+          </w:tcPr>
+          <w:p>
+            <w:r>
+              <w:t>Result</w:t>
+            </w:r>
+          </w:p>
+        </w:tc>
+      </w:tr>
+      <w:tr>
+        <w:tc>
+          <w:tcPr>
+            <w:tcW w:w="715" w:type="dxa"/>
+          </w:tcPr>
+          <w:p>
+            <w:r>
+              <w:t>e1</w:t>
+            </w:r>
+          </w:p>
+        </w:tc>
+        <w:tc>
+          <w:tcPr>
+            <w:tcW w:w="2790" w:type="dxa"/>
+          </w:tcPr>
+          <w:p>
+            <w:r>
+              <w:t>Factoid</w:t>
+            </w:r>
+          </w:p>
+        </w:tc>
+        <w:tc>
+          <w:tcPr>
+            <w:tcW w:w="4500" w:type="dxa"/>
+          </w:tcPr>
+          <w:p>
+            <w:proofErr w:type="spellStart"/>
+            <w:r>
+              <w:t>Antirequisite</w:t>
+            </w:r>
+            <w:proofErr w:type="spellEnd"/>
+            <w:r>
+              <w:t xml:space="preserve"> course for CS 431?</w:t>
+            </w:r>
+          </w:p>
+        </w:tc>
+        <w:tc>
+          <w:tcPr>
+            <w:tcW w:w="1350" w:type="dxa"/>
+          </w:tcPr>
+          <w:p>
+            <w:r>
+              <w:t>Correct</w:t>
+            </w:r>
+          </w:p>
+        </w:tc>
+      </w:tr>
+      <w:tr>
+        <w:tc>
+          <w:tcPr>
+            <w:tcW w:w="715" w:type="dxa"/>
+          </w:tcPr>
+          <w:p>
+            <w:r>
+              <w:t>e2</w:t>
+            </w:r>
+          </w:p>
+        </w:tc>
+        <w:tc>
+          <w:tcPr>
+            <w:tcW w:w="2790" w:type="dxa"/>
+          </w:tcPr>
+          <w:p>
+            <w:r>
+              <w:t>Factoid</w:t>
+            </w:r>
+          </w:p>
+        </w:tc>
+        <w:tc>
+          <w:tcPr>
+            <w:tcW w:w="4500" w:type="dxa"/>
+          </w:tcPr>
+          <w:p>
+            <w:r>
+              <w:t>Prerequisites for CO 227?</w:t>
+            </w:r>
+          </w:p>
+        </w:tc>
+        <w:tc>
+          <w:tcPr>
+            <w:tcW w:w="1350" w:type="dxa"/>
+          </w:tcPr>
+          <w:p>
+            <w:r>
+              <w:t>Correct*</w:t>
+            </w:r>
+          </w:p>
+        </w:tc>
+      </w:tr>
+      <w:tr>
+        <w:tc>
+          <w:tcPr>
+            <w:tcW w:w="715" w:type="dxa"/>
+          </w:tcPr>
+          <w:p>
+            <w:r>
+              <w:t>e3</w:t>
+            </w:r>
+          </w:p>
+        </w:tc>
+        <w:tc>
+          <w:tcPr>
+            <w:tcW w:w="2790" w:type="dxa"/>
+          </w:tcPr>
+          <w:p>
+            <w:r>
+              <w:t>Factoid</w:t>
+            </w:r>
+          </w:p>
+        </w:tc>
+        <w:tc>
+          <w:tcPr>
+            <w:tcW w:w="4500" w:type="dxa"/>
+          </w:tcPr>
+          <w:p>
+            <w:r>
+              <w:t>Survival function estimators in ACTSC 454?</w:t>
+            </w:r>
+          </w:p>
+        </w:tc>
+        <w:tc>
+          <w:tcPr>
+            <w:tcW w:w="1350" w:type="dxa"/>
+          </w:tcPr>
+          <w:p>
+            <w:r>
+              <w:t>Correct</w:t>
+            </w:r>
+          </w:p>
+        </w:tc>
+      </w:tr>
+      <w:tr>
+        <w:tc>
+          <w:tcPr>
+            <w:tcW w:w="715" w:type="dxa"/>
+          </w:tcPr>
+          <w:p>
+            <w:r>
+              <w:t>e4</w:t>
+            </w:r>
+          </w:p>
+        </w:tc>
+        <w:tc>
+          <w:tcPr>
+            <w:tcW w:w="2790" w:type="dxa"/>
+          </w:tcPr>
+          <w:p>
+            <w:r>
+              <w:t>Factoid</w:t>
+            </w:r>
+          </w:p>
+        </w:tc>
+        <w:tc>
+          <w:tcPr>
+            <w:tcW w:w="4500" w:type="dxa"/>
+          </w:tcPr>
+          <w:p>
+            <w:r>
+              <w:t>Corequisite for CS 136?</w:t>
+            </w:r>
+          </w:p>
+        </w:tc>
+        <w:tc>
+          <w:tcPr>
+            <w:tcW w:w="1350" w:type="dxa"/>
+          </w:tcPr>
+          <w:p>
+            <w:r>
+              <w:t>Correct</w:t>
+            </w:r>
+          </w:p>
+        </w:tc>
+      </w:tr>
+      <w:tr>
+        <w:tc>
+          <w:tcPr>
+            <w:tcW w:w="715" w:type="dxa"/>
+          </w:tcPr>
+          <w:p>
+            <w:r>
+              <w:t>e5</w:t>
+            </w:r>
+          </w:p>
+        </w:tc>
+        <w:tc>
+          <w:tcPr>
+            <w:tcW w:w="2790" w:type="dxa"/>
+          </w:tcPr>
+          <w:p>
+            <w:r>
+              <w:t>Factoid</w:t>
+            </w:r>
+          </w:p>
+        </w:tc>
+        <w:tc>
+          <w:tcPr>
+            <w:tcW w:w="4500" w:type="dxa"/>
+          </w:tcPr>
+          <w:p>
+            <w:r>
+              <w:t>Prerequisite for PMATH 331?</w:t>
+            </w:r>
+          </w:p>
+        </w:tc>
+        <w:tc>
+          <w:tcPr>
+            <w:tcW w:w="1350" w:type="dxa"/>
+          </w:tcPr>
+          <w:p>
+            <w:r>
+              <w:t>Correct</w:t>
+            </w:r>
+          </w:p>
+        </w:tc>
+      </w:tr>
+      <w:tr>
+        <w:tc>
+          <w:tcPr>
+            <w:tcW w:w="715" w:type="dxa"/>
+          </w:tcPr>
+          <w:p>
+            <w:r>
+              <w:t>e6</w:t>
+            </w:r>
+          </w:p>
+        </w:tc>
+        <w:tc>
+          <w:tcPr>
+            <w:tcW w:w="2790" w:type="dxa"/>
+          </w:tcPr>
+          <w:p>
+            <w:r>
+              <w:t>Factoid</w:t>
+            </w:r>
+          </w:p>
+        </w:tc>
+        <w:tc>
+          <w:tcPr>
+            <w:tcW w:w="4500" w:type="dxa"/>
+          </w:tcPr>
+          <w:p>
+            <w:r>
+              <w:t>Student restriction for MATH 247?</w:t>
+            </w:r>
+          </w:p>
+        </w:tc>
+        <w:tc>
+          <w:tcPr>
+            <w:tcW w:w="1350" w:type="dxa"/>
+          </w:tcPr>
+          <w:p>
+            <w:r>
+              <w:t>Correct</w:t>
+            </w:r>
+          </w:p>
+        </w:tc>
+      </w:tr>
+      <w:tr>
+        <w:tc>
+          <w:tcPr>
+            <w:tcW w:w="715" w:type="dxa"/>
+          </w:tcPr>
+          <w:p>
+            <w:r>
+              <w:t>e7</w:t>
+            </w:r>
+          </w:p>
+        </w:tc>
+        <w:tc>
+          <w:tcPr>
+            <w:tcW w:w="2790" w:type="dxa"/>
+          </w:tcPr>
+          <w:p>
+            <w:r>
+              <w:t>Multi-hop</w:t>
+            </w:r>
+          </w:p>
+        </w:tc>
+        <w:tc>
+          <w:tcPr>
+            <w:tcW w:w="4500" w:type="dxa"/>
+          </w:tcPr>
+          <w:p>
+            <w:r>
+              <w:t xml:space="preserve">Do AMATH 331 and PMATH 331 share </w:t>
+            </w:r>
+            <w:proofErr w:type="spellStart"/>
+            <w:r>
+              <w:t>antirequisites</w:t>
+            </w:r>
+            <w:proofErr w:type="spellEnd"/>
+            <w:r>
+              <w:t>?</w:t>
+            </w:r>
+          </w:p>
+        </w:tc>
+        <w:tc>
+          <w:tcPr>
+            <w:tcW w:w="1350" w:type="dxa"/>
+          </w:tcPr>
+          <w:p>
+            <w:r>
+              <w:t>Correct*</w:t>
+            </w:r>
+          </w:p>
+        </w:tc>
+      </w:tr>
+      <w:tr>
+        <w:tc>
+          <w:tcPr>
+            <w:tcW w:w="715" w:type="dxa"/>
+          </w:tcPr>
+          <w:p>
+            <w:r>
+              <w:t>e8</w:t>
+            </w:r>
+          </w:p>
+        </w:tc>
+        <w:tc>
+          <w:tcPr>
+            <w:tcW w:w="2790" w:type="dxa"/>
+          </w:tcPr>
+          <w:p>
+            <w:r>
+              <w:t>Multi-hop</w:t>
+            </w:r>
+          </w:p>
+        </w:tc>
+        <w:tc>
+          <w:tcPr>
+            <w:tcW w:w="4500" w:type="dxa"/>
+          </w:tcPr>
+          <w:p>
+            <w:r>
+              <w:t>Are CS 251E and CS 348 restricted to the same programs?</w:t>
+            </w:r>
+          </w:p>
+        </w:tc>
+        <w:tc>
+          <w:tcPr>
+            <w:tcW w:w="1350" w:type="dxa"/>
+          </w:tcPr>
+          <w:p>
+            <w:r>
+              <w:t>Correct</w:t>
+            </w:r>
+          </w:p>
+        </w:tc>
+      </w:tr>
+      <w:tr>
+        <w:tc>
+          <w:tcPr>
+            <w:tcW w:w="715" w:type="dxa"/>
+          </w:tcPr>
+          <w:p>
+            <w:r>
+              <w:t>e9</w:t>
+            </w:r>
+          </w:p>
+        </w:tc>
+        <w:tc>
+          <w:tcPr>
+            <w:tcW w:w="2790" w:type="dxa"/>
+          </w:tcPr>
+          <w:p>
+            <w:r>
+              <w:t>Unanswerable</w:t>
+            </w:r>
+          </w:p>
+        </w:tc>
+        <w:tc>
+          <w:tcPr>
+            <w:tcW w:w="4500" w:type="dxa"/>
+          </w:tcPr>
+          <w:p>
+            <w:r>
+              <w:t>Instructor for STAT 442, Fall 2025?</w:t>
+            </w:r>
+          </w:p>
+        </w:tc>
+        <w:tc>
+          <w:tcPr>
+            <w:tcW w:w="1350" w:type="dxa"/>
+          </w:tcPr>
+          <w:p>
+            <w:r>
+              <w:t>Abstained</w:t>
+            </w:r>
+          </w:p>
+        </w:tc>
+      </w:tr>
+      <w:tr>
+        <w:tc>
+          <w:tcPr>
+            <w:tcW w:w="715" w:type="dxa"/>
+          </w:tcPr>
+          <w:p>
+            <w:r>
+              <w:t>e10</w:t>
+            </w:r>
+          </w:p>
+        </w:tc>
+        <w:tc>
+          <w:tcPr>
+            <w:tcW w:w="2790" w:type="dxa"/>
+          </w:tcPr>
+          <w:p>
+            <w:r>
+              <w:t>Unanswerable</w:t>
+            </w:r>
+          </w:p>
+        </w:tc>
+        <w:tc>
+          <w:tcPr>
+            <w:tcW w:w="4500" w:type="dxa"/>
+          </w:tcPr>
+          <w:p>
+            <w:r>
+              <w:t>Tuition cost for a 0.5-unit course?</w:t>
+            </w:r>
+          </w:p>
+        </w:tc>
+        <w:tc>
+          <w:tcPr>
+            <w:tcW w:w="1350" w:type="dxa"/>
+          </w:tcPr>
+          <w:p>
+            <w:r>
+              <w:t>Abstained</w:t>
+            </w:r>
+          </w:p>
+        </w:tc>
+      </w:tr>
+    </w:tbl>
+    <w:p/>
+    <w:p>
+      <w:pPr>
+        <w:spacing w:after="140"/>
+      </w:pPr>
+      <w:r>
+        <w:rPr>
+          <w:i/>
+          <w:iCs/>
+        </w:rPr>
+        <w:t>*e2 and e7 are flagged because</w:t>
+      </w:r>
+      <w:r>
+        <w:rPr>
+          <w:i/>
+          <w:iCs/>
+        </w:rPr>
+        <w:t xml:space="preserve"> </w:t>
+      </w:r>
+      <w:r>
+        <w:rPr>
+          <w:i/>
+          <w:iCs/>
+        </w:rPr>
+        <w:t xml:space="preserve">before </w:t>
+      </w:r>
+      <w:r>
+        <w:rPr>
+          <w:i/>
+          <w:iCs/>
+        </w:rPr>
+        <w:t>I</w:t>
+      </w:r>
+      <w:r>
+        <w:rPr>
+          <w:i/>
+          <w:iCs/>
+        </w:rPr>
+        <w:t xml:space="preserve"> fixed generation determinism, both questions failed on at least one earlier run despite unchanged retrieval and identical question text. e2 twice gave an incorrect "I don't know" refusal even though the correct chunk was retrieved and contained the answer, and e7 gave a self-contradictory multi-hop answer that seemed to mix up the two near-duplicate source chunks. Both settled into consistently correct answers once temperature was fixed to 0 and a seed was pinned. </w:t>
+      </w:r>
+    </w:p>
+    <w:p>
+      <w:pPr>
+        <w:rPr>
+          <w:rFonts w:asciiTheme="majorHAnsi" w:eastAsiaTheme="majorEastAsia" w:hAnsiTheme="majorHAnsi" w:cstheme="majorBidi"/>
+          <w:color w:val="0F4761" w:themeColor="accent1" w:themeShade="BF"/>
+          <w:sz w:val="32"/>
+          <w:szCs w:val="32"/>
+        </w:rPr>
+      </w:pPr>
+      <w:r>
+        <w:br w:type="page"/>
+      </w:r>
+    </w:p>
+    <w:p>
+      <w:pPr>
+        <w:pStyle w:val="Heading2"/>
+      </w:pPr>
+      <w:r>
+        <w:lastRenderedPageBreak/>
+        <w:t>8. Error Analysis</w:t>
+      </w:r>
+    </w:p>
+    <w:p>
+      <w:pPr>
+        <w:pStyle w:val="Heading3"/>
+      </w:pPr>
+      <w:r>
+        <w:t>Case 1: Retrieval Failure on Identifier-Style Queries</w:t>
+      </w:r>
+    </w:p>
+    <w:p>
+      <w:r>
+        <w:t>Query: "What is the prerequisite for STAT 442?" BM25 correctly ranks STAT 442 first by a wide margin, a score of 23.0, more than double its nearest competitor, by exact matching on the token "442". Dense retrieval doesn't place STAT 442 within its top 40 of 342 candidates for this query. A bare catalog number carries no exploitable semantic content for an embedding model, so dense retrieval surfaces topically similar STAT courses instead. Because RRF rewards agreement between retrievers rather than confidence from either one alone, BM25's strong, correct signal gets outweighed by several documents both retrievers only rank moderately, and STAT 442 ends up excluded from the final top-5 context passed to the generator. The generator, correctly following its instructions, responds "I don't know" instead of hallucinating a plausible prerequisite</w:t>
+      </w:r>
+      <w:r>
+        <w:t xml:space="preserve">, demonstrating a </w:t>
+      </w:r>
+      <w:r>
+        <w:t>success for the generation-side safeguard</w:t>
+      </w:r>
+      <w:r>
+        <w:t xml:space="preserve"> </w:t>
+      </w:r>
+      <w:r>
+        <w:t>but a failure of the retrieval stage.</w:t>
+      </w:r>
+    </w:p>
+    <w:p>
+      <w:r>
+        <w:t>A control experiment using a purely semantic paraphrase of the same underlying need, "interactive methods for visually exploring high-dimensional data", which avoids the course code entirely, shows dense retrieval correctly ranking STAT 442 first with a decisive score margin. That confirms the failure above is specific to identifier-style queries, not a general defect in the dense retriever.</w:t>
+      </w:r>
+    </w:p>
+    <w:p>
+      <w:r>
+        <w:t>A possible fix is to replace pure rank-based RRF with score-normalized weighted fusion, so a large absolute BM25 score can outweigh dense silence, or to guarantee that each retriever's single top-ranked candidate survives into the final candidate pool no matter its fused rank.</w:t>
+      </w:r>
+    </w:p>
+    <w:p>
+      <w:pPr>
+        <w:pStyle w:val="Heading3"/>
+      </w:pPr>
+      <w:r>
+        <w:t>Case 2: Generation Instability under Unpinned Sampling</w:t>
+      </w:r>
+    </w:p>
+    <w:p>
+      <w:r>
+        <w:t xml:space="preserve">Before </w:t>
+      </w:r>
+      <w:r>
+        <w:t>I</w:t>
+      </w:r>
+      <w:r>
+        <w:t xml:space="preserve"> fixed temperature and seed, the question "Which introductory-level courses can serve as a prerequisite for CO 227?" got answered "I don't know" on two consecutive runs, even though CO 227 was correctly retrieved at rank 1 or 2 and its description contained the exact prerequisite list. Once temperature was fixed to 0, the same question was answered correctly and consistently across runs. This shows that even a well-specified prompt with explicit context-grounding instructions can behave inconsistently, and occasionally incorrectly, without deterministic decoding. </w:t>
+      </w:r>
+    </w:p>
+    <w:p>
+      <w:pPr>
+        <w:pStyle w:val="Heading2"/>
+      </w:pPr>
+      <w:r>
+        <w:t>9. Limitations</w:t>
+      </w:r>
+    </w:p>
+    <w:p>
+      <w:pPr>
+        <w:pStyle w:val="ListParagraph"/>
+        <w:numPr>
+          <w:ilvl w:val="0"/>
+          <w:numId w:val="4"/>
+        </w:numPr>
+        <w:spacing w:after="60" w:line="240" w:lineRule="auto"/>
+      </w:pPr>
+      <w:r>
+        <w:t xml:space="preserve">This is a </w:t>
+      </w:r>
+      <w:r>
+        <w:t>single-faculty, single-institution corpus of 342 documents, so results may not generalize to other domains, document types, or larger corpora.</w:t>
+      </w:r>
+    </w:p>
+    <w:p>
+      <w:pPr>
+        <w:pStyle w:val="ListParagraph"/>
+        <w:numPr>
+          <w:ilvl w:val="0"/>
+          <w:numId w:val="4"/>
+        </w:numPr>
+        <w:spacing w:after="60" w:line="240" w:lineRule="auto"/>
+      </w:pPr>
+      <w:r>
+        <w:lastRenderedPageBreak/>
+        <w:t>The evaluation set of 10 questions meets the assignment's minimum size but is still small. Per-question outcomes should be read as illustrative rather than statistically robust estimates of system performance.</w:t>
+      </w:r>
+    </w:p>
+    <w:p>
+      <w:pPr>
+        <w:pStyle w:val="ListParagraph"/>
+        <w:numPr>
+          <w:ilvl w:val="0"/>
+          <w:numId w:val="4"/>
+        </w:numPr>
+        <w:spacing w:after="60" w:line="240" w:lineRule="auto"/>
+      </w:pPr>
+      <w:r>
+        <w:t>RRF fusion is simple and reasonably well-motivated for combining scores on different scales, but it has a documented failure mode (Case 1) that a more sophisticated, score-aware fusion strategy could likely fix.</w:t>
+      </w:r>
+    </w:p>
+    <w:p>
+      <w:pPr>
+        <w:pStyle w:val="ListParagraph"/>
+        <w:numPr>
+          <w:ilvl w:val="0"/>
+          <w:numId w:val="4"/>
+        </w:numPr>
+        <w:spacing w:after="60" w:line="240" w:lineRule="auto"/>
+      </w:pPr>
+      <w:r>
+        <w:t>I</w:t>
+      </w:r>
+      <w:r>
+        <w:t xml:space="preserve"> didn't produce a formal ablation table isolating BM25-only or dense-only end-to-end accuracy beyond the qualitative comparisons in Section 8. A fuller ablation would strengthen the retrieval analysis.</w:t>
+      </w:r>
+    </w:p>
+    <w:p>
+      <w:pPr>
+        <w:pStyle w:val="ListParagraph"/>
+        <w:numPr>
+          <w:ilvl w:val="0"/>
+          <w:numId w:val="4"/>
+        </w:numPr>
+        <w:spacing w:after="60" w:line="240" w:lineRule="auto"/>
+      </w:pPr>
+      <w:r>
+        <w:t>The stub-description filter is a heuristic, a word-count floor plus regex patterns, and even after one correction during development it may still be imperfectly separating genuinely uninformative placeholder entries from legitimately terse ones.</w:t>
+      </w:r>
+    </w:p>
+    <w:p>
+      <w:pPr>
+        <w:pStyle w:val="Heading2"/>
+      </w:pPr>
+      <w:r>
+        <w:t>10. Repository and Demo</w:t>
+      </w:r>
+    </w:p>
+    <w:p>
+      <w:pPr>
+        <w:spacing w:line="276" w:lineRule="auto"/>
+      </w:pPr>
+      <w:r>
+        <w:t>Git</w:t>
+      </w:r>
+      <w:r>
+        <w:t>H</w:t>
+      </w:r>
+      <w:r>
+        <w:t>ub</w:t>
+      </w:r>
+      <w:r>
+        <w:t xml:space="preserve"> Repository</w:t>
+      </w:r>
+      <w:r>
+        <w:t xml:space="preserve">: </w:t>
+      </w:r>
+      <w:hyperlink r:id="rId5" w:history="1">
+        <w:r>
+          <w:rPr>
+            <w:rStyle w:val="Hyperlink"/>
+          </w:rPr>
+          <w:t>https://github.com/GamerSwagnamite/CP423-Project</w:t>
+        </w:r>
+      </w:hyperlink>
+    </w:p>
+    <w:p>
+      <w:pPr>
+        <w:spacing w:line="276" w:lineRule="auto"/>
+      </w:pPr>
+      <w:r>
+        <w:t xml:space="preserve">Demo Video: </w:t>
+      </w:r>
+    </w:p>
+    <w:p>
+      <w:pPr>
+        <w:spacing w:line="276" w:lineRule="auto"/>
+      </w:pPr>
+    </w:p>
+    <w:p>
+      <w:pPr>
+        <w:spacing w:line="276" w:lineRule="auto"/>
       </w:pPr>
     </w:p>
     <w:p/>
@@ -49,6 +1449,451 @@
     </w:sectPr>
   </w:body>
 </w:document>
+</file>
+
+<file path=word/numbering.xml><?xml version="1.0" encoding="utf-8"?>
+<w:numbering xmlns:wpc="http://schemas.microsoft.com/office/word/2010/wordprocessingCanvas" xmlns:cx="http://schemas.microsoft.com/office/drawing/2014/chartex" xmlns:cx1="http://schemas.microsoft.com/office/drawing/2015/9/8/chartex" xmlns:cx2="http://schemas.microsoft.com/office/drawing/2015/10/21/chartex" xmlns:cx3="http://schemas.microsoft.com/office/drawing/2016/5/9/chartex" xmlns:cx4="http://schemas.microsoft.com/office/drawing/2016/5/10/chartex" xmlns:cx5="http://schemas.microsoft.com/office/drawing/2016/5/11/chartex" xmlns:cx6="http://schemas.microsoft.com/office/drawing/2016/5/12/chartex" xmlns:cx7="http://schemas.microsoft.com/office/drawing/2016/5/13/chartex" xmlns:cx8="http://schemas.microsoft.com/office/drawing/2016/5/14/chartex" xmlns:mc="http://schemas.openxmlformats.org/markup-compatibility/2006" xmlns:aink="http://schemas.microsoft.com/office/drawing/2016/ink" xmlns:am3d="http://schemas.microsoft.com/office/drawing/2017/model3d" xmlns:o="urn:schemas-microsoft-com:office:office" xmlns:oel="http://schemas.microsoft.com/office/2019/extlst" xmlns:r="http://schemas.openxmlformats.org/officeDocument/2006/relationships" xmlns:m="http://schemas.openxmlformats.org/officeDocument/2006/math" xmlns:v="urn:schemas-microsoft-com:vml" xmlns:wp14="http://schemas.microsoft.com/office/word/2010/wordprocessingDrawing" xmlns:wp="http://schemas.openxmlformats.org/drawingml/2006/wordprocessingDrawing" xmlns:w10="urn:schemas-microsoft-com:office:word" xmlns:w="http://schemas.openxmlformats.org/wordprocessingml/2006/main" xmlns:w14="http://schemas.microsoft.com/office/word/2010/wordml" xmlns:w15="http://schemas.microsoft.com/office/word/2012/wordml" xmlns:w16cei="http://schemas.microsoft.com/office/word/2026/wordml/cei" xmlns:w16cex="http://schemas.microsoft.com/office/word/2018/wordml/cex" xmlns:w16cid="http://schemas.microsoft.com/office/word/2016/wordml/cid" xmlns:w16="http://schemas.microsoft.com/office/word/2018/wordml" xmlns:w16du="http://schemas.microsoft.com/office/word/2023/wordml/word16du" xmlns:w16sdtdh="http://schemas.microsoft.com/office/word/2020/wordml/sdtdatahash" xmlns:w16sdtfl="http://schemas.microsoft.com/office/word/2024/wordml/sdtformatlock" xmlns:w16se="http://schemas.microsoft.com/office/word/2015/wordml/symex" xmlns:wpg="http://schemas.microsoft.com/office/word/2010/wordprocessingGroup" xmlns:wpi="http://schemas.microsoft.com/office/word/2010/wordprocessingInk" xmlns:wne="http://schemas.microsoft.com/office/word/2006/wordml" xmlns:wps="http://schemas.microsoft.com/office/word/2010/wordprocessingShape" mc:Ignorable="w14 w15 w16se w16cid w16 w16cex w16sdtdh w16sdtfl w16du wp14">
+  <w:abstractNum w:abstractNumId="0" w15:restartNumberingAfterBreak="0">
+    <w:nsid w:val="20CD120C"/>
+    <w:multiLevelType w:val="hybridMultilevel"/>
+    <w:tmpl w:val="20CA31D6"/>
+    <w:lvl w:ilvl="0" w:tplc="6C4E87E8">
+      <w:start w:val="1"/>
+      <w:numFmt w:val="bullet"/>
+      <w:lvlText w:val="●"/>
+      <w:lvlJc w:val="left"/>
+      <w:pPr>
+        <w:ind w:left="720" w:hanging="360"/>
+      </w:pPr>
+    </w:lvl>
+    <w:lvl w:ilvl="1" w:tplc="607E3804">
+      <w:start w:val="1"/>
+      <w:numFmt w:val="bullet"/>
+      <w:lvlText w:val="○"/>
+      <w:lvlJc w:val="left"/>
+      <w:pPr>
+        <w:ind w:left="1440" w:hanging="360"/>
+      </w:pPr>
+    </w:lvl>
+    <w:lvl w:ilvl="2" w:tplc="60228818">
+      <w:start w:val="1"/>
+      <w:numFmt w:val="bullet"/>
+      <w:lvlText w:val="■"/>
+      <w:lvlJc w:val="left"/>
+      <w:pPr>
+        <w:ind w:left="2160" w:hanging="360"/>
+      </w:pPr>
+    </w:lvl>
+    <w:lvl w:ilvl="3" w:tplc="7534D962">
+      <w:start w:val="1"/>
+      <w:numFmt w:val="bullet"/>
+      <w:lvlText w:val="●"/>
+      <w:lvlJc w:val="left"/>
+      <w:pPr>
+        <w:ind w:left="2880" w:hanging="360"/>
+      </w:pPr>
+    </w:lvl>
+    <w:lvl w:ilvl="4" w:tplc="16B691F4">
+      <w:start w:val="1"/>
+      <w:numFmt w:val="bullet"/>
+      <w:lvlText w:val="○"/>
+      <w:lvlJc w:val="left"/>
+      <w:pPr>
+        <w:ind w:left="3600" w:hanging="360"/>
+      </w:pPr>
+    </w:lvl>
+    <w:lvl w:ilvl="5" w:tplc="DFAEA188">
+      <w:start w:val="1"/>
+      <w:numFmt w:val="bullet"/>
+      <w:lvlText w:val="■"/>
+      <w:lvlJc w:val="left"/>
+      <w:pPr>
+        <w:ind w:left="4320" w:hanging="360"/>
+      </w:pPr>
+    </w:lvl>
+    <w:lvl w:ilvl="6" w:tplc="853CDEAE">
+      <w:start w:val="1"/>
+      <w:numFmt w:val="bullet"/>
+      <w:lvlText w:val="●"/>
+      <w:lvlJc w:val="left"/>
+      <w:pPr>
+        <w:ind w:left="5040" w:hanging="360"/>
+      </w:pPr>
+    </w:lvl>
+    <w:lvl w:ilvl="7" w:tplc="38B4E372">
+      <w:start w:val="1"/>
+      <w:numFmt w:val="bullet"/>
+      <w:lvlText w:val="●"/>
+      <w:lvlJc w:val="left"/>
+      <w:pPr>
+        <w:ind w:left="5760" w:hanging="360"/>
+      </w:pPr>
+    </w:lvl>
+    <w:lvl w:ilvl="8" w:tplc="12A6E140">
+      <w:start w:val="1"/>
+      <w:numFmt w:val="bullet"/>
+      <w:lvlText w:val="●"/>
+      <w:lvlJc w:val="left"/>
+      <w:pPr>
+        <w:ind w:left="6480" w:hanging="360"/>
+      </w:pPr>
+    </w:lvl>
+  </w:abstractNum>
+  <w:abstractNum w:abstractNumId="1" w15:restartNumberingAfterBreak="0">
+    <w:nsid w:val="2A7B705C"/>
+    <w:multiLevelType w:val="hybridMultilevel"/>
+    <w:tmpl w:val="89527F66"/>
+    <w:lvl w:ilvl="0" w:tplc="10090001">
+      <w:start w:val="1"/>
+      <w:numFmt w:val="bullet"/>
+      <w:lvlText w:val=""/>
+      <w:lvlJc w:val="left"/>
+      <w:pPr>
+        <w:ind w:left="720" w:hanging="360"/>
+      </w:pPr>
+      <w:rPr>
+        <w:rFonts w:ascii="Symbol" w:hAnsi="Symbol" w:hint="default"/>
+      </w:rPr>
+    </w:lvl>
+    <w:lvl w:ilvl="1" w:tplc="10090003" w:tentative="1">
+      <w:start w:val="1"/>
+      <w:numFmt w:val="bullet"/>
+      <w:lvlText w:val="o"/>
+      <w:lvlJc w:val="left"/>
+      <w:pPr>
+        <w:ind w:left="1440" w:hanging="360"/>
+      </w:pPr>
+      <w:rPr>
+        <w:rFonts w:ascii="Courier New" w:hAnsi="Courier New" w:cs="Courier New" w:hint="default"/>
+      </w:rPr>
+    </w:lvl>
+    <w:lvl w:ilvl="2" w:tplc="10090005" w:tentative="1">
+      <w:start w:val="1"/>
+      <w:numFmt w:val="bullet"/>
+      <w:lvlText w:val=""/>
+      <w:lvlJc w:val="left"/>
+      <w:pPr>
+        <w:ind w:left="2160" w:hanging="360"/>
+      </w:pPr>
+      <w:rPr>
+        <w:rFonts w:ascii="Wingdings" w:hAnsi="Wingdings" w:hint="default"/>
+      </w:rPr>
+    </w:lvl>
+    <w:lvl w:ilvl="3" w:tplc="10090001" w:tentative="1">
+      <w:start w:val="1"/>
+      <w:numFmt w:val="bullet"/>
+      <w:lvlText w:val=""/>
+      <w:lvlJc w:val="left"/>
+      <w:pPr>
+        <w:ind w:left="2880" w:hanging="360"/>
+      </w:pPr>
+      <w:rPr>
+        <w:rFonts w:ascii="Symbol" w:hAnsi="Symbol" w:hint="default"/>
+      </w:rPr>
+    </w:lvl>
+    <w:lvl w:ilvl="4" w:tplc="10090003" w:tentative="1">
+      <w:start w:val="1"/>
+      <w:numFmt w:val="bullet"/>
+      <w:lvlText w:val="o"/>
+      <w:lvlJc w:val="left"/>
+      <w:pPr>
+        <w:ind w:left="3600" w:hanging="360"/>
+      </w:pPr>
+      <w:rPr>
+        <w:rFonts w:ascii="Courier New" w:hAnsi="Courier New" w:cs="Courier New" w:hint="default"/>
+      </w:rPr>
+    </w:lvl>
+    <w:lvl w:ilvl="5" w:tplc="10090005" w:tentative="1">
+      <w:start w:val="1"/>
+      <w:numFmt w:val="bullet"/>
+      <w:lvlText w:val=""/>
+      <w:lvlJc w:val="left"/>
+      <w:pPr>
+        <w:ind w:left="4320" w:hanging="360"/>
+      </w:pPr>
+      <w:rPr>
+        <w:rFonts w:ascii="Wingdings" w:hAnsi="Wingdings" w:hint="default"/>
+      </w:rPr>
+    </w:lvl>
+    <w:lvl w:ilvl="6" w:tplc="10090001" w:tentative="1">
+      <w:start w:val="1"/>
+      <w:numFmt w:val="bullet"/>
+      <w:lvlText w:val=""/>
+      <w:lvlJc w:val="left"/>
+      <w:pPr>
+        <w:ind w:left="5040" w:hanging="360"/>
+      </w:pPr>
+      <w:rPr>
+        <w:rFonts w:ascii="Symbol" w:hAnsi="Symbol" w:hint="default"/>
+      </w:rPr>
+    </w:lvl>
+    <w:lvl w:ilvl="7" w:tplc="10090003" w:tentative="1">
+      <w:start w:val="1"/>
+      <w:numFmt w:val="bullet"/>
+      <w:lvlText w:val="o"/>
+      <w:lvlJc w:val="left"/>
+      <w:pPr>
+        <w:ind w:left="5760" w:hanging="360"/>
+      </w:pPr>
+      <w:rPr>
+        <w:rFonts w:ascii="Courier New" w:hAnsi="Courier New" w:cs="Courier New" w:hint="default"/>
+      </w:rPr>
+    </w:lvl>
+    <w:lvl w:ilvl="8" w:tplc="10090005" w:tentative="1">
+      <w:start w:val="1"/>
+      <w:numFmt w:val="bullet"/>
+      <w:lvlText w:val=""/>
+      <w:lvlJc w:val="left"/>
+      <w:pPr>
+        <w:ind w:left="6480" w:hanging="360"/>
+      </w:pPr>
+      <w:rPr>
+        <w:rFonts w:ascii="Wingdings" w:hAnsi="Wingdings" w:hint="default"/>
+      </w:rPr>
+    </w:lvl>
+  </w:abstractNum>
+  <w:abstractNum w:abstractNumId="2" w15:restartNumberingAfterBreak="0">
+    <w:nsid w:val="43596CED"/>
+    <w:multiLevelType w:val="hybridMultilevel"/>
+    <w:tmpl w:val="190C30CC"/>
+    <w:lvl w:ilvl="0" w:tplc="10090001">
+      <w:start w:val="1"/>
+      <w:numFmt w:val="bullet"/>
+      <w:lvlText w:val=""/>
+      <w:lvlJc w:val="left"/>
+      <w:pPr>
+        <w:ind w:left="720" w:hanging="360"/>
+      </w:pPr>
+      <w:rPr>
+        <w:rFonts w:ascii="Symbol" w:hAnsi="Symbol" w:hint="default"/>
+      </w:rPr>
+    </w:lvl>
+    <w:lvl w:ilvl="1" w:tplc="10090003" w:tentative="1">
+      <w:start w:val="1"/>
+      <w:numFmt w:val="bullet"/>
+      <w:lvlText w:val="o"/>
+      <w:lvlJc w:val="left"/>
+      <w:pPr>
+        <w:ind w:left="1440" w:hanging="360"/>
+      </w:pPr>
+      <w:rPr>
+        <w:rFonts w:ascii="Courier New" w:hAnsi="Courier New" w:cs="Courier New" w:hint="default"/>
+      </w:rPr>
+    </w:lvl>
+    <w:lvl w:ilvl="2" w:tplc="10090005" w:tentative="1">
+      <w:start w:val="1"/>
+      <w:numFmt w:val="bullet"/>
+      <w:lvlText w:val=""/>
+      <w:lvlJc w:val="left"/>
+      <w:pPr>
+        <w:ind w:left="2160" w:hanging="360"/>
+      </w:pPr>
+      <w:rPr>
+        <w:rFonts w:ascii="Wingdings" w:hAnsi="Wingdings" w:hint="default"/>
+      </w:rPr>
+    </w:lvl>
+    <w:lvl w:ilvl="3" w:tplc="10090001" w:tentative="1">
+      <w:start w:val="1"/>
+      <w:numFmt w:val="bullet"/>
+      <w:lvlText w:val=""/>
+      <w:lvlJc w:val="left"/>
+      <w:pPr>
+        <w:ind w:left="2880" w:hanging="360"/>
+      </w:pPr>
+      <w:rPr>
+        <w:rFonts w:ascii="Symbol" w:hAnsi="Symbol" w:hint="default"/>
+      </w:rPr>
+    </w:lvl>
+    <w:lvl w:ilvl="4" w:tplc="10090003" w:tentative="1">
+      <w:start w:val="1"/>
+      <w:numFmt w:val="bullet"/>
+      <w:lvlText w:val="o"/>
+      <w:lvlJc w:val="left"/>
+      <w:pPr>
+        <w:ind w:left="3600" w:hanging="360"/>
+      </w:pPr>
+      <w:rPr>
+        <w:rFonts w:ascii="Courier New" w:hAnsi="Courier New" w:cs="Courier New" w:hint="default"/>
+      </w:rPr>
+    </w:lvl>
+    <w:lvl w:ilvl="5" w:tplc="10090005" w:tentative="1">
+      <w:start w:val="1"/>
+      <w:numFmt w:val="bullet"/>
+      <w:lvlText w:val=""/>
+      <w:lvlJc w:val="left"/>
+      <w:pPr>
+        <w:ind w:left="4320" w:hanging="360"/>
+      </w:pPr>
+      <w:rPr>
+        <w:rFonts w:ascii="Wingdings" w:hAnsi="Wingdings" w:hint="default"/>
+      </w:rPr>
+    </w:lvl>
+    <w:lvl w:ilvl="6" w:tplc="10090001" w:tentative="1">
+      <w:start w:val="1"/>
+      <w:numFmt w:val="bullet"/>
+      <w:lvlText w:val=""/>
+      <w:lvlJc w:val="left"/>
+      <w:pPr>
+        <w:ind w:left="5040" w:hanging="360"/>
+      </w:pPr>
+      <w:rPr>
+        <w:rFonts w:ascii="Symbol" w:hAnsi="Symbol" w:hint="default"/>
+      </w:rPr>
+    </w:lvl>
+    <w:lvl w:ilvl="7" w:tplc="10090003" w:tentative="1">
+      <w:start w:val="1"/>
+      <w:numFmt w:val="bullet"/>
+      <w:lvlText w:val="o"/>
+      <w:lvlJc w:val="left"/>
+      <w:pPr>
+        <w:ind w:left="5760" w:hanging="360"/>
+      </w:pPr>
+      <w:rPr>
+        <w:rFonts w:ascii="Courier New" w:hAnsi="Courier New" w:cs="Courier New" w:hint="default"/>
+      </w:rPr>
+    </w:lvl>
+    <w:lvl w:ilvl="8" w:tplc="10090005" w:tentative="1">
+      <w:start w:val="1"/>
+      <w:numFmt w:val="bullet"/>
+      <w:lvlText w:val=""/>
+      <w:lvlJc w:val="left"/>
+      <w:pPr>
+        <w:ind w:left="6480" w:hanging="360"/>
+      </w:pPr>
+      <w:rPr>
+        <w:rFonts w:ascii="Wingdings" w:hAnsi="Wingdings" w:hint="default"/>
+      </w:rPr>
+    </w:lvl>
+  </w:abstractNum>
+  <w:abstractNum w:abstractNumId="3" w15:restartNumberingAfterBreak="0">
+    <w:nsid w:val="741110AC"/>
+    <w:multiLevelType w:val="hybridMultilevel"/>
+    <w:tmpl w:val="8C784268"/>
+    <w:lvl w:ilvl="0" w:tplc="10090001">
+      <w:start w:val="1"/>
+      <w:numFmt w:val="bullet"/>
+      <w:lvlText w:val=""/>
+      <w:lvlJc w:val="left"/>
+      <w:pPr>
+        <w:ind w:left="720" w:hanging="360"/>
+      </w:pPr>
+      <w:rPr>
+        <w:rFonts w:ascii="Symbol" w:hAnsi="Symbol" w:hint="default"/>
+      </w:rPr>
+    </w:lvl>
+    <w:lvl w:ilvl="1" w:tplc="10090003" w:tentative="1">
+      <w:start w:val="1"/>
+      <w:numFmt w:val="bullet"/>
+      <w:lvlText w:val="o"/>
+      <w:lvlJc w:val="left"/>
+      <w:pPr>
+        <w:ind w:left="1440" w:hanging="360"/>
+      </w:pPr>
+      <w:rPr>
+        <w:rFonts w:ascii="Courier New" w:hAnsi="Courier New" w:cs="Courier New" w:hint="default"/>
+      </w:rPr>
+    </w:lvl>
+    <w:lvl w:ilvl="2" w:tplc="10090005" w:tentative="1">
+      <w:start w:val="1"/>
+      <w:numFmt w:val="bullet"/>
+      <w:lvlText w:val=""/>
+      <w:lvlJc w:val="left"/>
+      <w:pPr>
+        <w:ind w:left="2160" w:hanging="360"/>
+      </w:pPr>
+      <w:rPr>
+        <w:rFonts w:ascii="Wingdings" w:hAnsi="Wingdings" w:hint="default"/>
+      </w:rPr>
+    </w:lvl>
+    <w:lvl w:ilvl="3" w:tplc="10090001" w:tentative="1">
+      <w:start w:val="1"/>
+      <w:numFmt w:val="bullet"/>
+      <w:lvlText w:val=""/>
+      <w:lvlJc w:val="left"/>
+      <w:pPr>
+        <w:ind w:left="2880" w:hanging="360"/>
+      </w:pPr>
+      <w:rPr>
+        <w:rFonts w:ascii="Symbol" w:hAnsi="Symbol" w:hint="default"/>
+      </w:rPr>
+    </w:lvl>
+    <w:lvl w:ilvl="4" w:tplc="10090003" w:tentative="1">
+      <w:start w:val="1"/>
+      <w:numFmt w:val="bullet"/>
+      <w:lvlText w:val="o"/>
+      <w:lvlJc w:val="left"/>
+      <w:pPr>
+        <w:ind w:left="3600" w:hanging="360"/>
+      </w:pPr>
+      <w:rPr>
+        <w:rFonts w:ascii="Courier New" w:hAnsi="Courier New" w:cs="Courier New" w:hint="default"/>
+      </w:rPr>
+    </w:lvl>
+    <w:lvl w:ilvl="5" w:tplc="10090005" w:tentative="1">
+      <w:start w:val="1"/>
+      <w:numFmt w:val="bullet"/>
+      <w:lvlText w:val=""/>
+      <w:lvlJc w:val="left"/>
+      <w:pPr>
+        <w:ind w:left="4320" w:hanging="360"/>
+      </w:pPr>
+      <w:rPr>
+        <w:rFonts w:ascii="Wingdings" w:hAnsi="Wingdings" w:hint="default"/>
+      </w:rPr>
+    </w:lvl>
+    <w:lvl w:ilvl="6" w:tplc="10090001" w:tentative="1">
+      <w:start w:val="1"/>
+      <w:numFmt w:val="bullet"/>
+      <w:lvlText w:val=""/>
+      <w:lvlJc w:val="left"/>
+      <w:pPr>
+        <w:ind w:left="5040" w:hanging="360"/>
+      </w:pPr>
+      <w:rPr>
+        <w:rFonts w:ascii="Symbol" w:hAnsi="Symbol" w:hint="default"/>
+      </w:rPr>
+    </w:lvl>
+    <w:lvl w:ilvl="7" w:tplc="10090003" w:tentative="1">
+      <w:start w:val="1"/>
+      <w:numFmt w:val="bullet"/>
+      <w:lvlText w:val="o"/>
+      <w:lvlJc w:val="left"/>
+      <w:pPr>
+        <w:ind w:left="5760" w:hanging="360"/>
+      </w:pPr>
+      <w:rPr>
+        <w:rFonts w:ascii="Courier New" w:hAnsi="Courier New" w:cs="Courier New" w:hint="default"/>
+      </w:rPr>
+    </w:lvl>
+    <w:lvl w:ilvl="8" w:tplc="10090005" w:tentative="1">
+      <w:start w:val="1"/>
+      <w:numFmt w:val="bullet"/>
+      <w:lvlText w:val=""/>
+      <w:lvlJc w:val="left"/>
+      <w:pPr>
+        <w:ind w:left="6480" w:hanging="360"/>
+      </w:pPr>
+      <w:rPr>
+        <w:rFonts w:ascii="Wingdings" w:hAnsi="Wingdings" w:hint="default"/>
+      </w:rPr>
+    </w:lvl>
+  </w:abstractNum>
+  <w:num w:numId="1" w16cid:durableId="1594585531">
+    <w:abstractNumId w:val="0"/>
+    <w:lvlOverride w:ilvl="0">
+      <w:startOverride w:val="1"/>
+    </w:lvlOverride>
+  </w:num>
+  <w:num w:numId="2" w16cid:durableId="1382824654">
+    <w:abstractNumId w:val="2"/>
+  </w:num>
+  <w:num w:numId="3" w16cid:durableId="1350178876">
+    <w:abstractNumId w:val="3"/>
+  </w:num>
+  <w:num w:numId="4" w16cid:durableId="1171526350">
+    <w:abstractNumId w:val="1"/>
+  </w:num>
+</w:numbering>
 </file>
 
 <file path=word/styles.xml><?xml version="1.0" encoding="utf-8"?>
@@ -250,7 +2095,7 @@
     <w:lsdException w:name="Medium Shading 2 Accent 1" w:uiPriority="64"/>
     <w:lsdException w:name="Medium List 1 Accent 1" w:uiPriority="65"/>
     <w:lsdException w:name="Revision" w:semiHidden="1"/>
-    <w:lsdException w:name="List Paragraph" w:uiPriority="34" w:qFormat="1"/>
+    <w:lsdException w:name="List Paragraph" w:uiPriority="0" w:qFormat="1"/>
     <w:lsdException w:name="Quote" w:uiPriority="29" w:qFormat="1"/>
     <w:lsdException w:name="Intense Quote" w:uiPriority="30" w:qFormat="1"/>
     <w:lsdException w:name="Medium List 2 Accent 1" w:uiPriority="66"/>
@@ -479,7 +2324,6 @@
     <w:next w:val="Normal"/>
     <w:link w:val="Heading2Char"/>
     <w:uiPriority w:val="9"/>
-    <w:semiHidden/>
     <w:unhideWhenUsed/>
     <w:qFormat/>
     <w:rsid w:val="00E209A4"/>
@@ -502,7 +2346,6 @@
     <w:next w:val="Normal"/>
     <w:link w:val="Heading3Char"/>
     <w:uiPriority w:val="9"/>
-    <w:semiHidden/>
     <w:unhideWhenUsed/>
     <w:qFormat/>
     <w:rsid w:val="00E209A4"/>
@@ -696,7 +2539,6 @@
     <w:basedOn w:val="DefaultParagraphFont"/>
     <w:link w:val="Heading2"/>
     <w:uiPriority w:val="9"/>
-    <w:semiHidden/>
     <w:rsid w:val="00E209A4"/>
     <w:rPr>
       <w:rFonts w:asciiTheme="majorHAnsi" w:eastAsiaTheme="majorEastAsia" w:hAnsiTheme="majorHAnsi" w:cstheme="majorBidi"/>
@@ -710,7 +2552,6 @@
     <w:basedOn w:val="DefaultParagraphFont"/>
     <w:link w:val="Heading3"/>
     <w:uiPriority w:val="9"/>
-    <w:semiHidden/>
     <w:rsid w:val="00E209A4"/>
     <w:rPr>
       <w:rFonts w:eastAsiaTheme="majorEastAsia" w:cstheme="majorBidi"/>
@@ -899,7 +2740,6 @@
   <w:style w:type="paragraph" w:styleId="ListParagraph">
     <w:name w:val="List Paragraph"/>
     <w:basedOn w:val="Normal"/>
-    <w:uiPriority w:val="34"/>
     <w:qFormat/>
     <w:rsid w:val="00E209A4"/>
     <w:pPr>
@@ -967,6 +2807,48 @@
       <w:color w:val="0F4761" w:themeColor="accent1" w:themeShade="BF"/>
       <w:spacing w:val="5"/>
     </w:rPr>
+  </w:style>
+  <w:style w:type="character" w:styleId="Hyperlink">
+    <w:name w:val="Hyperlink"/>
+    <w:basedOn w:val="DefaultParagraphFont"/>
+    <w:uiPriority w:val="99"/>
+    <w:unhideWhenUsed/>
+    <w:rsid w:val="00C43336"/>
+    <w:rPr>
+      <w:color w:val="467886" w:themeColor="hyperlink"/>
+      <w:u w:val="single"/>
+    </w:rPr>
+  </w:style>
+  <w:style w:type="character" w:styleId="UnresolvedMention">
+    <w:name w:val="Unresolved Mention"/>
+    <w:basedOn w:val="DefaultParagraphFont"/>
+    <w:uiPriority w:val="99"/>
+    <w:semiHidden/>
+    <w:unhideWhenUsed/>
+    <w:rsid w:val="00C43336"/>
+    <w:rPr>
+      <w:color w:val="605E5C"/>
+      <w:shd w:val="clear" w:color="auto" w:fill="E1DFDD"/>
+    </w:rPr>
+  </w:style>
+  <w:style w:type="table" w:styleId="TableGrid">
+    <w:name w:val="Table Grid"/>
+    <w:basedOn w:val="TableNormal"/>
+    <w:uiPriority w:val="39"/>
+    <w:rsid w:val="00642B2A"/>
+    <w:pPr>
+      <w:spacing w:after="0" w:line="240" w:lineRule="auto"/>
+    </w:pPr>
+    <w:tblPr>
+      <w:tblBorders>
+        <w:top w:val="single" w:sz="4" w:space="0" w:color="auto"/>
+        <w:left w:val="single" w:sz="4" w:space="0" w:color="auto"/>
+        <w:bottom w:val="single" w:sz="4" w:space="0" w:color="auto"/>
+        <w:right w:val="single" w:sz="4" w:space="0" w:color="auto"/>
+        <w:insideH w:val="single" w:sz="4" w:space="0" w:color="auto"/>
+        <w:insideV w:val="single" w:sz="4" w:space="0" w:color="auto"/>
+      </w:tblBorders>
+    </w:tblPr>
   </w:style>
 </w:styles>
 </file>

</xml_diff>